<commit_message>
Implementato il download di file in formato .docx
Download dei file in formato .docx implementato. Corretto errore nella libreria docx_template che provocava errore.
</commit_message>
<xml_diff>
--- a/assets/docs/template.docx
+++ b/assets/docs/template.docx
@@ -3,10 +3,41 @@
 <w:document xmlns:wpc="http://schemas.microsoft.com/office/word/2010/wordprocessingCanvas" xmlns:cx="http://schemas.microsoft.com/office/drawing/2014/chartex" xmlns:cx1="http://schemas.microsoft.com/office/drawing/2015/9/8/chartex" xmlns:cx2="http://schemas.microsoft.com/office/drawing/2015/10/21/chartex" xmlns:cx3="http://schemas.microsoft.com/office/drawing/2016/5/9/chartex" xmlns:cx4="http://schemas.microsoft.com/office/drawing/2016/5/10/chartex" xmlns:cx5="http://schemas.microsoft.com/office/drawing/2016/5/11/chartex" xmlns:cx6="http://schemas.microsoft.com/office/drawing/2016/5/12/chartex" xmlns:cx7="http://schemas.microsoft.com/office/drawing/2016/5/13/chartex" xmlns:cx8="http://schemas.microsoft.com/office/drawing/2016/5/14/chartex" xmlns:mc="http://schemas.openxmlformats.org/markup-compatibility/2006" xmlns:aink="http://schemas.microsoft.com/office/drawing/2016/ink" xmlns:am3d="http://schemas.microsoft.com/office/drawing/2017/model3d" xmlns:o="urn:schemas-microsoft-com:office:office" xmlns:oel="http://schemas.microsoft.com/office/2019/extlst" xmlns:r="http://schemas.openxmlformats.org/officeDocument/2006/relationships" xmlns:m="http://schemas.openxmlformats.org/officeDocument/2006/math" xmlns:v="urn:schemas-microsoft-com:vml" xmlns:wp14="http://schemas.microsoft.com/office/word/2010/wordprocessingDrawing" xmlns:wp="http://schemas.openxmlformats.org/drawingml/2006/wordprocessingDrawing" xmlns:w10="urn:schemas-microsoft-com:office:word" xmlns:w="http://schemas.openxmlformats.org/wordprocessingml/2006/main" xmlns:w14="http://schemas.microsoft.com/office/word/2010/wordml" xmlns:w15="http://schemas.microsoft.com/office/word/2012/wordml" xmlns:w16cex="http://schemas.microsoft.com/office/word/2018/wordml/cex" xmlns:w16cid="http://schemas.microsoft.com/office/word/2016/wordml/cid" xmlns:w16="http://schemas.microsoft.com/office/word/2018/wordml" xmlns:w16du="http://schemas.microsoft.com/office/word/2023/wordml/word16du" xmlns:w16sdtdh="http://schemas.microsoft.com/office/word/2020/wordml/sdtdatahash" xmlns:w16se="http://schemas.microsoft.com/office/word/2015/wordml/symex" xmlns:wpg="http://schemas.microsoft.com/office/word/2010/wordprocessingGroup" xmlns:wpi="http://schemas.microsoft.com/office/word/2010/wordprocessingInk" xmlns:wne="http://schemas.microsoft.com/office/word/2006/wordml" xmlns:wps="http://schemas.microsoft.com/office/word/2010/wordprocessingShape" mc:Ignorable="w14 w15 w16se w16cid w16 w16cex w16sdtdh w16du wp14">
   <w:body>
     <w:p>
-      <w:r>
-        <w:t>sorry</w:t>
-      </w:r>
+      <w:pPr>
+        <w:spacing w:after="120"/>
+        <w:rPr>
+          <w:rFonts w:ascii="Times New Roman" w:hAnsi="Times New Roman" w:cs="Times New Roman"/>
+          <w:sz w:val="24"/>
+          <w:szCs w:val="24"/>
+          <w:lang w:val="en-US"/>
+        </w:rPr>
+      </w:pPr>
+      <w:sdt>
+        <w:sdtPr>
+          <w:rPr>
+            <w:rFonts w:ascii="Times New Roman" w:hAnsi="Times New Roman" w:cs="Times New Roman"/>
+            <w:sz w:val="24"/>
+            <w:szCs w:val="24"/>
+            <w:lang w:val="en-US"/>
+          </w:rPr>
+          <w:alias w:val="risposta"/>
+          <w:tag w:val="text"/>
+          <w:id w:val="2765826"/>
+        </w:sdtPr>
+        <w:sdtContent>
+          <w:r>
+            <w:rPr>
+              <w:rFonts w:ascii="Times New Roman" w:hAnsi="Times New Roman" w:cs="Times New Roman"/>
+              <w:sz w:val="24"/>
+              <w:szCs w:val="24"/>
+              <w:lang w:val="en-US"/>
+            </w:rPr>
+            <w:t>risposta</w:t>
+          </w:r>
+        </w:sdtContent>
+      </w:sdt>
     </w:p>
+    <w:p/>
     <w:sectPr>
       <w:pgSz w:w="11906" w:h="16838"/>
       <w:pgMar w:top="1417" w:right="1134" w:bottom="1134" w:left="1134" w:header="708" w:footer="708" w:gutter="0"/>
@@ -415,6 +446,13 @@
   <w:style w:type="paragraph" w:default="1" w:styleId="Normale">
     <w:name w:val="Normal"/>
     <w:qFormat/>
+    <w:rsid w:val="0018534A"/>
+    <w:pPr>
+      <w:spacing w:after="200" w:line="276" w:lineRule="auto"/>
+    </w:pPr>
+    <w:rPr>
+      <w:lang w:val="ru-RU"/>
+    </w:rPr>
   </w:style>
   <w:style w:type="character" w:default="1" w:styleId="Carpredefinitoparagrafo">
     <w:name w:val="Default Paragraph Font"/>
@@ -442,6 +480,16 @@
     <w:uiPriority w:val="99"/>
     <w:semiHidden/>
     <w:unhideWhenUsed/>
+  </w:style>
+  <w:style w:type="character" w:styleId="Testosegnaposto">
+    <w:name w:val="Placeholder Text"/>
+    <w:basedOn w:val="Carpredefinitoparagrafo"/>
+    <w:uiPriority w:val="99"/>
+    <w:semiHidden/>
+    <w:rsid w:val="00982E94"/>
+    <w:rPr>
+      <w:color w:val="666666"/>
+    </w:rPr>
   </w:style>
 </w:styles>
 </file>

</xml_diff>